<commit_message>
Tarea 1.3: keep each figure subtitle on the same page as its figure (keep_with_next)
</commit_message>
<xml_diff>
--- a/3er-semestre/visualizacion-grandes-bases-datos/tareas/Tarea1_3/Tarea1_3_VisualizacionGBD_CarlosPulidoRosas.docx
+++ b/3er-semestre/visualizacion-grandes-bases-datos/tareas/Tarea1_3/Tarea1_3_VisualizacionGBD_CarlosPulidoRosas.docx
@@ -714,6 +714,7 @@
     </w:p>
     <w:p>
       <w:pPr>
+        <w:keepNext/>
         <w:spacing w:before="140" w:after="60"/>
         <w:jc w:val="left"/>
       </w:pPr>
@@ -730,6 +731,7 @@
     </w:p>
     <w:p>
       <w:pPr>
+        <w:keepNext/>
         <w:spacing w:before="0" w:after="60"/>
         <w:jc w:val="both"/>
       </w:pPr>
@@ -800,6 +802,7 @@
     </w:p>
     <w:p>
       <w:pPr>
+        <w:keepNext/>
         <w:spacing w:before="140" w:after="60"/>
         <w:jc w:val="left"/>
       </w:pPr>
@@ -871,6 +874,7 @@
     </w:p>
     <w:p>
       <w:pPr>
+        <w:keepNext/>
         <w:spacing w:before="140" w:after="60"/>
         <w:jc w:val="left"/>
       </w:pPr>

</xml_diff>